<commit_message>
Enhance LLM integration and batch processing capabilities.
- Added OpenAI LLM provider for structured case extraction and email generation.
- Implemented BatchProcessor for sequential document processing, including CSV and run manifest generation.
- Introduced new service functions for email and summary generation from validated complaint cases.
- Updated CLI to support new LLM provider options and improved logging.
- Added error handling for LLM-related failures and validation issues.
- Expanded documentation and example files for better user guidance.
</commit_message>
<xml_diff>
--- a/data/samples/service_issue.docx
+++ b/data/samples/service_issue.docx
@@ -4,22 +4,7 @@
   <w:body>
     <w:p>
       <w:r>
-        <w:t>Service Complaint — Fictional Sample</w:t>
-      </w:r>
-    </w:p>
-    <w:p>
-      <w:r>
-        <w:t>Customer: Sam Ortega</w:t>
-      </w:r>
-    </w:p>
-    <w:p>
-      <w:r>
-        <w:t>Phone: +1-555-014-8890</w:t>
-      </w:r>
-    </w:p>
-    <w:p>
-      <w:r>
-        <w:t>I waited 45 minutes on hold and never received a callback about my open ticket TCK-1902.</w:t>
+        <w:t>I waited 45 minutes on hold and never received a callback.</w:t>
       </w:r>
     </w:p>
     <w:sectPr>

</xml_diff>